<commit_message>
finished gui and updated docs!
</commit_message>
<xml_diff>
--- a/Documentation/NEA Documentation.docx
+++ b/Documentation/NEA Documentation.docx
@@ -3269,21 +3269,12 @@
           <w:szCs w:val="28"/>
         </w:rPr>
       </w:pPr>
-      <w:proofErr w:type="spellStart"/>
       <w:r>
         <w:rPr>
           <w:sz w:val="28"/>
           <w:szCs w:val="28"/>
         </w:rPr>
-        <w:t>Zoho</w:t>
-      </w:r>
-      <w:proofErr w:type="spellEnd"/>
-      <w:r>
-        <w:rPr>
-          <w:sz w:val="28"/>
-          <w:szCs w:val="28"/>
-        </w:rPr>
-        <w:t xml:space="preserve"> inventory is an inventory management system that shares similar features that I would like</w:t>
+        <w:t>Zoho inventory is an inventory management system that shares similar features that I would like</w:t>
       </w:r>
       <w:r>
         <w:rPr>
@@ -5244,23 +5235,7 @@
           <w:sz w:val="24"/>
           <w:szCs w:val="24"/>
         </w:rPr>
-        <w:t xml:space="preserve"> be </w:t>
-      </w:r>
-      <w:proofErr w:type="spellStart"/>
-      <w:r>
-        <w:rPr>
-          <w:sz w:val="24"/>
-          <w:szCs w:val="24"/>
-        </w:rPr>
-        <w:t>to</w:t>
-      </w:r>
-      <w:proofErr w:type="spellEnd"/>
-      <w:r>
-        <w:rPr>
-          <w:sz w:val="24"/>
-          <w:szCs w:val="24"/>
-        </w:rPr>
-        <w:t xml:space="preserve"> complex, </w:t>
+        <w:t xml:space="preserve"> be to complex, </w:t>
       </w:r>
       <w:r>
         <w:rPr>
@@ -5371,23 +5346,7 @@
           <w:sz w:val="24"/>
           <w:szCs w:val="24"/>
         </w:rPr>
-        <w:t xml:space="preserve">I am going to be programming this an </w:t>
-      </w:r>
-      <w:proofErr w:type="spellStart"/>
-      <w:r>
-        <w:rPr>
-          <w:sz w:val="24"/>
-          <w:szCs w:val="24"/>
-        </w:rPr>
-        <w:t>c#</w:t>
-      </w:r>
-      <w:proofErr w:type="spellEnd"/>
-      <w:r>
-        <w:rPr>
-          <w:sz w:val="24"/>
-          <w:szCs w:val="24"/>
-        </w:rPr>
-        <w:t xml:space="preserve"> so </w:t>
+        <w:t xml:space="preserve">I am going to be programming this an c# so </w:t>
       </w:r>
       <w:r>
         <w:rPr>
@@ -5668,23 +5627,7 @@
           <w:szCs w:val="24"/>
         </w:rPr>
         <w:tab/>
-        <w:t xml:space="preserve">program. This is a functionality </w:t>
-      </w:r>
-      <w:proofErr w:type="spellStart"/>
-      <w:r>
-        <w:rPr>
-          <w:sz w:val="24"/>
-          <w:szCs w:val="24"/>
-        </w:rPr>
-        <w:t>critera</w:t>
-      </w:r>
-      <w:proofErr w:type="spellEnd"/>
-      <w:r>
-        <w:rPr>
-          <w:sz w:val="24"/>
-          <w:szCs w:val="24"/>
-        </w:rPr>
-        <w:t xml:space="preserve">  that makes sure that all the features can be easily </w:t>
+        <w:t xml:space="preserve">program. This is a functionality critera  that makes sure that all the features can be easily </w:t>
       </w:r>
       <w:r>
         <w:rPr>
@@ -5811,23 +5754,7 @@
           <w:szCs w:val="24"/>
         </w:rPr>
         <w:tab/>
-        <w:t xml:space="preserve">program.  this is a functionality criteria . This is needed to make sure that the </w:t>
-      </w:r>
-      <w:proofErr w:type="spellStart"/>
-      <w:r>
-        <w:rPr>
-          <w:sz w:val="24"/>
-          <w:szCs w:val="24"/>
-        </w:rPr>
-        <w:t>the</w:t>
-      </w:r>
-      <w:proofErr w:type="spellEnd"/>
-      <w:r>
-        <w:rPr>
-          <w:sz w:val="24"/>
-          <w:szCs w:val="24"/>
-        </w:rPr>
-        <w:t xml:space="preserve"> features </w:t>
+        <w:t xml:space="preserve">program.  this is a functionality criteria . This is needed to make sure that the the features </w:t>
       </w:r>
       <w:r>
         <w:rPr>
@@ -6077,23 +6004,7 @@
           <w:sz w:val="24"/>
           <w:szCs w:val="24"/>
         </w:rPr>
-        <w:t xml:space="preserve">Each of the menus is a module that needs to be developed, these separate sections for the most part won’t interact with each other and will be developed separate from each other by doing this it becomes easier to develop the modules as I can focus on one at a time </w:t>
-      </w:r>
-      <w:proofErr w:type="spellStart"/>
-      <w:r>
-        <w:rPr>
-          <w:sz w:val="24"/>
-          <w:szCs w:val="24"/>
-        </w:rPr>
-        <w:t>with out</w:t>
-      </w:r>
-      <w:proofErr w:type="spellEnd"/>
-      <w:r>
-        <w:rPr>
-          <w:sz w:val="24"/>
-          <w:szCs w:val="24"/>
-        </w:rPr>
-        <w:t xml:space="preserve"> having to worry about the other modules. It also means I can test and debug them separately</w:t>
+        <w:t>Each of the menus is a module that needs to be developed, these separate sections for the most part won’t interact with each other and will be developed separate from each other by doing this it becomes easier to develop the modules as I can focus on one at a time with out having to worry about the other modules. It also means I can test and debug them separately</w:t>
       </w:r>
       <w:r>
         <w:rPr>
@@ -6151,23 +6062,7 @@
           <w:sz w:val="24"/>
           <w:szCs w:val="24"/>
         </w:rPr>
-        <w:t xml:space="preserve">a “block” for one of the modules I can move to a different one that has a different problem to solve. This means I can carry one working on the program </w:t>
-      </w:r>
-      <w:proofErr w:type="spellStart"/>
-      <w:r>
-        <w:rPr>
-          <w:sz w:val="24"/>
-          <w:szCs w:val="24"/>
-        </w:rPr>
-        <w:t>with out</w:t>
-      </w:r>
-      <w:proofErr w:type="spellEnd"/>
-      <w:r>
-        <w:rPr>
-          <w:sz w:val="24"/>
-          <w:szCs w:val="24"/>
-        </w:rPr>
-        <w:t xml:space="preserve"> getting burnt-out as quick. It can also make focusing on one area easier as you </w:t>
+        <w:t xml:space="preserve">a “block” for one of the modules I can move to a different one that has a different problem to solve. This means I can carry one working on the program with out getting burnt-out as quick. It can also make focusing on one area easier as you </w:t>
       </w:r>
       <w:r>
         <w:rPr>
@@ -7230,21 +7125,12 @@
         </w:rPr>
         <w:tab/>
       </w:r>
-      <w:proofErr w:type="spellStart"/>
-      <w:r>
-        <w:rPr>
-          <w:sz w:val="24"/>
-          <w:szCs w:val="24"/>
-        </w:rPr>
-        <w:t>PsuedoCode</w:t>
-      </w:r>
-      <w:proofErr w:type="spellEnd"/>
-      <w:r>
-        <w:rPr>
-          <w:sz w:val="24"/>
-          <w:szCs w:val="24"/>
-        </w:rPr>
-        <w:t>:</w:t>
+      <w:r>
+        <w:rPr>
+          <w:sz w:val="24"/>
+          <w:szCs w:val="24"/>
+        </w:rPr>
+        <w:t>PsuedoCode:</w:t>
       </w:r>
     </w:p>
     <w:p>
@@ -7388,23 +7274,7 @@
           <w:sz w:val="24"/>
           <w:szCs w:val="24"/>
         </w:rPr>
-        <w:t xml:space="preserve">closes the window. </w:t>
-      </w:r>
-      <w:proofErr w:type="spellStart"/>
-      <w:r>
-        <w:rPr>
-          <w:sz w:val="24"/>
-          <w:szCs w:val="24"/>
-        </w:rPr>
-        <w:t>getData</w:t>
-      </w:r>
-      <w:proofErr w:type="spellEnd"/>
-      <w:r>
-        <w:rPr>
-          <w:sz w:val="24"/>
-          <w:szCs w:val="24"/>
-        </w:rPr>
-        <w:t xml:space="preserve"> and verify are defined below. </w:t>
+        <w:t xml:space="preserve">closes the window. getData and verify are defined below. </w:t>
       </w:r>
     </w:p>
     <w:p>
@@ -7471,23 +7341,7 @@
           <w:sz w:val="24"/>
           <w:szCs w:val="24"/>
         </w:rPr>
-        <w:t xml:space="preserve">This is  the </w:t>
-      </w:r>
-      <w:proofErr w:type="spellStart"/>
-      <w:r>
-        <w:rPr>
-          <w:sz w:val="24"/>
-          <w:szCs w:val="24"/>
-        </w:rPr>
-        <w:t>getData</w:t>
-      </w:r>
-      <w:proofErr w:type="spellEnd"/>
-      <w:r>
-        <w:rPr>
-          <w:sz w:val="24"/>
-          <w:szCs w:val="24"/>
-        </w:rPr>
-        <w:t xml:space="preserve"> function it simply gets the data and turns </w:t>
+        <w:t xml:space="preserve">This is  the getData function it simply gets the data and turns </w:t>
       </w:r>
       <w:r>
         <w:rPr>
@@ -7604,62 +7458,14 @@
           <w:sz w:val="24"/>
           <w:szCs w:val="24"/>
         </w:rPr>
-        <w:t xml:space="preserve">otherwise it gives an error message. </w:t>
-      </w:r>
-      <w:proofErr w:type="spellStart"/>
-      <w:r>
-        <w:rPr>
-          <w:sz w:val="24"/>
-          <w:szCs w:val="24"/>
-        </w:rPr>
-        <w:t>inDb</w:t>
-      </w:r>
-      <w:proofErr w:type="spellEnd"/>
-      <w:r>
-        <w:rPr>
-          <w:sz w:val="24"/>
-          <w:szCs w:val="24"/>
-        </w:rPr>
-        <w:t xml:space="preserve">, </w:t>
-      </w:r>
-      <w:proofErr w:type="spellStart"/>
-      <w:r>
-        <w:rPr>
-          <w:sz w:val="24"/>
-          <w:szCs w:val="24"/>
-        </w:rPr>
-        <w:t>matchDb</w:t>
-      </w:r>
-      <w:proofErr w:type="spellEnd"/>
-      <w:r>
-        <w:rPr>
-          <w:sz w:val="24"/>
-          <w:szCs w:val="24"/>
-        </w:rPr>
-        <w:t>, and</w:t>
-      </w:r>
-      <w:r>
-        <w:rPr>
-          <w:sz w:val="24"/>
-          <w:szCs w:val="24"/>
-        </w:rPr>
-        <w:t xml:space="preserve"> </w:t>
-      </w:r>
-      <w:proofErr w:type="spellStart"/>
-      <w:r>
-        <w:rPr>
-          <w:sz w:val="24"/>
-          <w:szCs w:val="24"/>
-        </w:rPr>
-        <w:t>getDb</w:t>
-      </w:r>
-      <w:proofErr w:type="spellEnd"/>
-      <w:r>
-        <w:rPr>
-          <w:sz w:val="24"/>
-          <w:szCs w:val="24"/>
-        </w:rPr>
-        <w:t xml:space="preserve"> are placeholder functions for SQL code. </w:t>
+        <w:t>otherwise it gives an error message. inDb, matchDb, and</w:t>
+      </w:r>
+      <w:r>
+        <w:rPr>
+          <w:sz w:val="24"/>
+          <w:szCs w:val="24"/>
+        </w:rPr>
+        <w:t xml:space="preserve"> getDb are placeholder functions for SQL code. </w:t>
       </w:r>
     </w:p>
     <w:p>
@@ -7790,17 +7596,8 @@
           <w:sz w:val="24"/>
           <w:szCs w:val="24"/>
         </w:rPr>
-        <w:t xml:space="preserve">Users table which holds data about the user currently only the permissions and </w:t>
-      </w:r>
-      <w:proofErr w:type="spellStart"/>
-      <w:r>
-        <w:rPr>
-          <w:sz w:val="24"/>
-          <w:szCs w:val="24"/>
-        </w:rPr>
-        <w:t>UserID</w:t>
-      </w:r>
-      <w:proofErr w:type="spellEnd"/>
+        <w:t>Users table which holds data about the user currently only the permissions and UserID</w:t>
+      </w:r>
       <w:r>
         <w:rPr>
           <w:sz w:val="24"/>
@@ -8550,13 +8347,8 @@
                       <wps:txbx>
                         <w:txbxContent>
                           <w:p>
-                            <w:proofErr w:type="spellStart"/>
                             <w:r>
-                              <w:t>Bg</w:t>
-                            </w:r>
-                            <w:proofErr w:type="spellEnd"/>
-                            <w:r>
-                              <w:t xml:space="preserve"> colour: </w:t>
+                              <w:t xml:space="preserve">Bg colour: </w:t>
                             </w:r>
                             <w:r>
                               <w:t>#a4dbc4</w:t>
@@ -8589,13 +8381,8 @@
                 <v:textbox>
                   <w:txbxContent>
                     <w:p>
-                      <w:proofErr w:type="spellStart"/>
                       <w:r>
-                        <w:t>Bg</w:t>
-                      </w:r>
-                      <w:proofErr w:type="spellEnd"/>
-                      <w:r>
-                        <w:t xml:space="preserve"> colour: </w:t>
+                        <w:t xml:space="preserve">Bg colour: </w:t>
                       </w:r>
                       <w:r>
                         <w:t>#a4dbc4</w:t>
@@ -9999,7 +9786,7 @@
     </w:p>
     <w:tbl>
       <w:tblPr>
-        <w:tblStyle w:val="GridTable6ColourfulAccent6"/>
+        <w:tblStyle w:val="GridTable6Colorful-Accent6"/>
         <w:tblW w:w="0" w:type="auto"/>
         <w:tblLook w:val="04A0" w:firstRow="1" w:lastRow="0" w:firstColumn="1" w:lastColumn="0" w:noHBand="0" w:noVBand="1"/>
       </w:tblPr>
@@ -10441,7 +10228,7 @@
     </w:p>
     <w:tbl>
       <w:tblPr>
-        <w:tblStyle w:val="GridTable6ColourfulAccent6"/>
+        <w:tblStyle w:val="GridTable6Colorful-Accent6"/>
         <w:tblW w:w="0" w:type="auto"/>
         <w:tblLook w:val="04A0" w:firstRow="1" w:lastRow="0" w:firstColumn="1" w:lastColumn="0" w:noHBand="0" w:noVBand="1"/>
       </w:tblPr>
@@ -10821,6 +10608,303 @@
     </w:p>
     <w:p>
       <w:pPr>
+        <w:pStyle w:val="Heading2"/>
+      </w:pPr>
+      <w:r>
+        <w:tab/>
+        <w:t>Login Menu</w:t>
+      </w:r>
+    </w:p>
+    <w:p>
+      <w:pPr>
+        <w:ind w:left="720"/>
+        <w:rPr>
+          <w:noProof/>
+        </w:rPr>
+      </w:pPr>
+      <w:r>
+        <w:t xml:space="preserve">I started </w:t>
+      </w:r>
+      <w:r>
+        <w:t>the development of the login menu with a GUI in WPF</w:t>
+      </w:r>
+      <w:r>
+        <w:t xml:space="preserve">. The gui didn’t have the functionality the module needed yet however it allows me to be able to build the rest of the module so that it can interact with this </w:t>
+      </w:r>
+      <w:r>
+        <w:t>menu.</w:t>
+      </w:r>
+      <w:r>
+        <w:rPr>
+          <w:noProof/>
+        </w:rPr>
+        <w:t xml:space="preserve"> </w:t>
+      </w:r>
+      <w:r>
+        <w:rPr>
+          <w:noProof/>
+        </w:rPr>
+        <w:drawing>
+          <wp:inline distT="0" distB="0" distL="0" distR="0" wp14:anchorId="1FA929A4" wp14:editId="37AF4049">
+            <wp:extent cx="3924300" cy="2352675"/>
+            <wp:effectExtent l="0" t="0" r="0" b="9525"/>
+            <wp:docPr id="22" name="Picture 22" descr="Graphical user interface&#10;&#10;Description automatically generated with medium confidence"/>
+            <wp:cNvGraphicFramePr>
+              <a:graphicFrameLocks xmlns:a="http://schemas.openxmlformats.org/drawingml/2006/main" noChangeAspect="1"/>
+            </wp:cNvGraphicFramePr>
+            <a:graphic xmlns:a="http://schemas.openxmlformats.org/drawingml/2006/main">
+              <a:graphicData uri="http://schemas.openxmlformats.org/drawingml/2006/picture">
+                <pic:pic xmlns:pic="http://schemas.openxmlformats.org/drawingml/2006/picture">
+                  <pic:nvPicPr>
+                    <pic:cNvPr id="22" name="Picture 22" descr="Graphical user interface&#10;&#10;Description automatically generated with medium confidence"/>
+                    <pic:cNvPicPr/>
+                  </pic:nvPicPr>
+                  <pic:blipFill>
+                    <a:blip r:embed="rId24"/>
+                    <a:stretch>
+                      <a:fillRect/>
+                    </a:stretch>
+                  </pic:blipFill>
+                  <pic:spPr>
+                    <a:xfrm>
+                      <a:off x="0" y="0"/>
+                      <a:ext cx="3924300" cy="2352675"/>
+                    </a:xfrm>
+                    <a:prstGeom prst="rect">
+                      <a:avLst/>
+                    </a:prstGeom>
+                  </pic:spPr>
+                </pic:pic>
+              </a:graphicData>
+            </a:graphic>
+          </wp:inline>
+        </w:drawing>
+      </w:r>
+    </w:p>
+    <w:p>
+      <w:pPr>
+        <w:ind w:left="720"/>
+        <w:rPr>
+          <w:noProof/>
+        </w:rPr>
+      </w:pPr>
+      <w:r>
+        <w:rPr>
+          <w:noProof/>
+        </w:rPr>
+        <w:t>This is the GUI I have built for the login menu it is based of the diagram shown earlier in the project about the design of the window.</w:t>
+      </w:r>
+      <w:r>
+        <w:rPr>
+          <w:noProof/>
+        </w:rPr>
+        <w:t xml:space="preserve"> Below is the XAML code used to create the </w:t>
+      </w:r>
+      <w:r>
+        <w:rPr>
+          <w:noProof/>
+        </w:rPr>
+        <w:t xml:space="preserve">GUI. WPF uses XAML to design its windows </w:t>
+      </w:r>
+      <w:r>
+        <w:rPr>
+          <w:noProof/>
+        </w:rPr>
+        <w:t>rather than c# code. The first  open window tag defines the window and its properities</w:t>
+      </w:r>
+      <w:r>
+        <w:rPr>
+          <w:noProof/>
+        </w:rPr>
+        <w:t>. The grid tag defines how many columns and rows there will be on the grid of the window and the other tags define the various elements in the window and their properties.</w:t>
+      </w:r>
+      <w:r>
+        <w:rPr>
+          <w:noProof/>
+        </w:rPr>
+        <w:t xml:space="preserve"> </w:t>
+      </w:r>
+      <w:r>
+        <w:rPr>
+          <w:noProof/>
+        </w:rPr>
+        <w:t xml:space="preserve">Below is also the c# file for the window </w:t>
+      </w:r>
+      <w:r>
+        <w:rPr>
+          <w:noProof/>
+        </w:rPr>
+        <w:t>the login menu is just the function to initialize the window and login button is a test function to check the demo button is working.</w:t>
+      </w:r>
+    </w:p>
+    <w:p>
+      <w:pPr>
+        <w:ind w:left="720"/>
+      </w:pPr>
+      <w:r>
+        <w:rPr>
+          <w:noProof/>
+        </w:rPr>
+        <w:lastRenderedPageBreak/>
+        <w:drawing>
+          <wp:inline distT="0" distB="0" distL="0" distR="0" wp14:anchorId="42A757C8" wp14:editId="6376D072">
+            <wp:extent cx="1637968" cy="3293363"/>
+            <wp:effectExtent l="0" t="0" r="635" b="2540"/>
+            <wp:docPr id="37" name="Picture 37" descr="Text&#10;&#10;Description automatically generated"/>
+            <wp:cNvGraphicFramePr>
+              <a:graphicFrameLocks xmlns:a="http://schemas.openxmlformats.org/drawingml/2006/main" noChangeAspect="1"/>
+            </wp:cNvGraphicFramePr>
+            <a:graphic xmlns:a="http://schemas.openxmlformats.org/drawingml/2006/main">
+              <a:graphicData uri="http://schemas.openxmlformats.org/drawingml/2006/picture">
+                <pic:pic xmlns:pic="http://schemas.openxmlformats.org/drawingml/2006/picture">
+                  <pic:nvPicPr>
+                    <pic:cNvPr id="37" name="Picture 37" descr="Text&#10;&#10;Description automatically generated"/>
+                    <pic:cNvPicPr/>
+                  </pic:nvPicPr>
+                  <pic:blipFill>
+                    <a:blip r:embed="rId25"/>
+                    <a:stretch>
+                      <a:fillRect/>
+                    </a:stretch>
+                  </pic:blipFill>
+                  <pic:spPr>
+                    <a:xfrm>
+                      <a:off x="0" y="0"/>
+                      <a:ext cx="1665915" cy="3349555"/>
+                    </a:xfrm>
+                    <a:prstGeom prst="rect">
+                      <a:avLst/>
+                    </a:prstGeom>
+                  </pic:spPr>
+                </pic:pic>
+              </a:graphicData>
+            </a:graphic>
+          </wp:inline>
+        </w:drawing>
+      </w:r>
+      <w:r>
+        <w:rPr>
+          <w:noProof/>
+        </w:rPr>
+        <w:drawing>
+          <wp:inline distT="0" distB="0" distL="0" distR="0" wp14:anchorId="00A1155C" wp14:editId="7E5453F5">
+            <wp:extent cx="3145135" cy="3290898"/>
+            <wp:effectExtent l="0" t="0" r="0" b="5080"/>
+            <wp:docPr id="30" name="Picture 30" descr="Graphical user interface, text&#10;&#10;Description automatically generated"/>
+            <wp:cNvGraphicFramePr>
+              <a:graphicFrameLocks xmlns:a="http://schemas.openxmlformats.org/drawingml/2006/main" noChangeAspect="1"/>
+            </wp:cNvGraphicFramePr>
+            <a:graphic xmlns:a="http://schemas.openxmlformats.org/drawingml/2006/main">
+              <a:graphicData uri="http://schemas.openxmlformats.org/drawingml/2006/picture">
+                <pic:pic xmlns:pic="http://schemas.openxmlformats.org/drawingml/2006/picture">
+                  <pic:nvPicPr>
+                    <pic:cNvPr id="30" name="Picture 30" descr="Graphical user interface, text&#10;&#10;Description automatically generated"/>
+                    <pic:cNvPicPr/>
+                  </pic:nvPicPr>
+                  <pic:blipFill>
+                    <a:blip r:embed="rId26"/>
+                    <a:stretch>
+                      <a:fillRect/>
+                    </a:stretch>
+                  </pic:blipFill>
+                  <pic:spPr>
+                    <a:xfrm>
+                      <a:off x="0" y="0"/>
+                      <a:ext cx="3186059" cy="3333719"/>
+                    </a:xfrm>
+                    <a:prstGeom prst="rect">
+                      <a:avLst/>
+                    </a:prstGeom>
+                  </pic:spPr>
+                </pic:pic>
+              </a:graphicData>
+            </a:graphic>
+          </wp:inline>
+        </w:drawing>
+      </w:r>
+      <w:r>
+        <w:rPr>
+          <w:noProof/>
+        </w:rPr>
+        <w:drawing>
+          <wp:inline distT="0" distB="0" distL="0" distR="0" wp14:anchorId="77F2CD27" wp14:editId="2EF95FB7">
+            <wp:extent cx="1931486" cy="2856424"/>
+            <wp:effectExtent l="0" t="0" r="0" b="1270"/>
+            <wp:docPr id="31" name="Picture 31" descr="Text&#10;&#10;Description automatically generated"/>
+            <wp:cNvGraphicFramePr>
+              <a:graphicFrameLocks xmlns:a="http://schemas.openxmlformats.org/drawingml/2006/main" noChangeAspect="1"/>
+            </wp:cNvGraphicFramePr>
+            <a:graphic xmlns:a="http://schemas.openxmlformats.org/drawingml/2006/main">
+              <a:graphicData uri="http://schemas.openxmlformats.org/drawingml/2006/picture">
+                <pic:pic xmlns:pic="http://schemas.openxmlformats.org/drawingml/2006/picture">
+                  <pic:nvPicPr>
+                    <pic:cNvPr id="31" name="Picture 31" descr="Text&#10;&#10;Description automatically generated"/>
+                    <pic:cNvPicPr/>
+                  </pic:nvPicPr>
+                  <pic:blipFill>
+                    <a:blip r:embed="rId27"/>
+                    <a:stretch>
+                      <a:fillRect/>
+                    </a:stretch>
+                  </pic:blipFill>
+                  <pic:spPr>
+                    <a:xfrm>
+                      <a:off x="0" y="0"/>
+                      <a:ext cx="1953999" cy="2889718"/>
+                    </a:xfrm>
+                    <a:prstGeom prst="rect">
+                      <a:avLst/>
+                    </a:prstGeom>
+                  </pic:spPr>
+                </pic:pic>
+              </a:graphicData>
+            </a:graphic>
+          </wp:inline>
+        </w:drawing>
+      </w:r>
+      <w:r>
+        <w:rPr>
+          <w:noProof/>
+        </w:rPr>
+        <w:drawing>
+          <wp:inline distT="0" distB="0" distL="0" distR="0" wp14:anchorId="71C71D06" wp14:editId="50A6DCB6">
+            <wp:extent cx="3260035" cy="2294849"/>
+            <wp:effectExtent l="0" t="0" r="0" b="0"/>
+            <wp:docPr id="38" name="Picture 38" descr="Text&#10;&#10;Description automatically generated"/>
+            <wp:cNvGraphicFramePr>
+              <a:graphicFrameLocks xmlns:a="http://schemas.openxmlformats.org/drawingml/2006/main" noChangeAspect="1"/>
+            </wp:cNvGraphicFramePr>
+            <a:graphic xmlns:a="http://schemas.openxmlformats.org/drawingml/2006/main">
+              <a:graphicData uri="http://schemas.openxmlformats.org/drawingml/2006/picture">
+                <pic:pic xmlns:pic="http://schemas.openxmlformats.org/drawingml/2006/picture">
+                  <pic:nvPicPr>
+                    <pic:cNvPr id="38" name="Picture 38" descr="Text&#10;&#10;Description automatically generated"/>
+                    <pic:cNvPicPr/>
+                  </pic:nvPicPr>
+                  <pic:blipFill>
+                    <a:blip r:embed="rId28"/>
+                    <a:stretch>
+                      <a:fillRect/>
+                    </a:stretch>
+                  </pic:blipFill>
+                  <pic:spPr>
+                    <a:xfrm>
+                      <a:off x="0" y="0"/>
+                      <a:ext cx="3306395" cy="2327483"/>
+                    </a:xfrm>
+                    <a:prstGeom prst="rect">
+                      <a:avLst/>
+                    </a:prstGeom>
+                  </pic:spPr>
+                </pic:pic>
+              </a:graphicData>
+            </a:graphic>
+          </wp:inline>
+        </w:drawing>
+      </w:r>
+    </w:p>
+    <w:p>
+      <w:pPr>
         <w:pStyle w:val="Heading1"/>
       </w:pPr>
       <w:bookmarkStart w:id="22" w:name="_Toc107759395"/>
@@ -10915,12 +10999,12 @@
       </w:pPr>
     </w:p>
     <w:sectPr>
-      <w:headerReference w:type="even" r:id="rId24"/>
-      <w:headerReference w:type="default" r:id="rId25"/>
-      <w:footerReference w:type="even" r:id="rId26"/>
-      <w:footerReference w:type="default" r:id="rId27"/>
-      <w:headerReference w:type="first" r:id="rId28"/>
-      <w:footerReference w:type="first" r:id="rId29"/>
+      <w:headerReference w:type="even" r:id="rId29"/>
+      <w:headerReference w:type="default" r:id="rId30"/>
+      <w:footerReference w:type="even" r:id="rId31"/>
+      <w:footerReference w:type="default" r:id="rId32"/>
+      <w:headerReference w:type="first" r:id="rId33"/>
+      <w:footerReference w:type="first" r:id="rId34"/>
       <w:pgSz w:w="11906" w:h="16838"/>
       <w:pgMar w:top="1440" w:right="1440" w:bottom="1440" w:left="1440" w:header="708" w:footer="708" w:gutter="0"/>
       <w:cols w:space="708"/>
@@ -12231,7 +12315,7 @@
       </w:tcPr>
     </w:tblStylePr>
   </w:style>
-  <w:style w:type="table" w:styleId="GridTable6ColourfulAccent6">
+  <w:style w:type="table" w:styleId="GridTable6Colorful-Accent6">
     <w:name w:val="Grid Table 6 Colorful Accent 6"/>
     <w:basedOn w:val="TableNormal"/>
     <w:uiPriority w:val="51"/>
@@ -12303,7 +12387,7 @@
       </w:tcPr>
     </w:tblStylePr>
   </w:style>
-  <w:style w:type="table" w:styleId="GridTable6ColourfulAccent1">
+  <w:style w:type="table" w:styleId="GridTable6Colorful-Accent1">
     <w:name w:val="Grid Table 6 Colorful Accent 1"/>
     <w:basedOn w:val="TableNormal"/>
     <w:uiPriority w:val="51"/>

</xml_diff>